<commit_message>
feat: comprehensive resume template optimization
- Fix font fallback: Garamond→Cambria, Helvetica→Calibri Light, Segoe UI→Arial
- Fix duplicate pBdr borders with _set_paragraph_bottom_border() helper
- Fix Corporate Elegance: restructure from two-column to single-column with teal header block
- Add cell margins and vertical alignment for two-column table layouts
- Replace unreliable Unicode decorators with standard borders
- Fresh Graduate: format skills as comma-separated inline text
- Add ATS compatibility badges (high/medium/low) to all template cards
- Fix Creative Portfolio preview to show large first-letter effect
- Fix Corporate Elegance preview to match new layout
- Add missing i18n keys: clickToPreview, atsHigh, atsMedium, atsLow
- Update seed data descriptions and regenerate all 8 sample DOCX files

Made-with: Cursor
</commit_message>
<xml_diff>
--- a/backend/data/templates/academic_research.docx
+++ b/backend/data/templates/academic_research.docx
@@ -4,34 +4,527 @@
   <w:body>
     <w:p>
       <w:pPr>
-        <w:pStyle w:val="Title"/>
+        <w:spacing w:before="0" w:after="120"/>
         <w:jc w:val="center"/>
       </w:pPr>
       <w:r>
         <w:rPr>
           <w:rFonts w:ascii="Times New Roman" w:hAnsi="Times New Roman"/>
+          <w:b/>
           <w:color w:val="0A2A4A"/>
-          <w:sz w:val="48"/>
+          <w:sz w:val="32"/>
         </w:rPr>
-        <w:t>Curriculum Vitae</w:t>
+        <w:t>CURRICULUM VITAE</w:t>
       </w:r>
     </w:p>
     <w:p>
       <w:pPr>
+        <w:pBdr>
+          <w:bottom w:val="single" w:sz="12" w:space="1" w:color="0a2a4a"/>
+        </w:pBdr>
+        <w:spacing w:before="40" w:after="80"/>
+      </w:pPr>
+    </w:p>
+    <w:p>
+      <w:pPr>
+        <w:spacing w:before="80" w:after="80"/>
         <w:jc w:val="center"/>
       </w:pPr>
       <w:r>
         <w:rPr>
-          <w:color w:val="0A2A4A"/>
-          <w:sz w:val="16"/>
+          <w:rFonts w:ascii="Times New Roman" w:hAnsi="Times New Roman"/>
+          <w:b/>
+          <w:color w:val="1A1A1A"/>
+          <w:sz w:val="36"/>
         </w:rPr>
-        <w:t>──────────────────────────────────────────────────</w:t>
+        <w:t>John Smith</w:t>
       </w:r>
     </w:p>
-    <w:p/>
     <w:p>
+      <w:pPr>
+        <w:spacing w:before="0" w:after="40"/>
+        <w:jc w:val="center"/>
+      </w:pPr>
       <w:r>
-        <w:t>{{ RESUME_CONTENT }}</w:t>
+        <w:rPr>
+          <w:rFonts w:ascii="Times New Roman" w:hAnsi="Times New Roman"/>
+          <w:color w:val="444444"/>
+          <w:sz w:val="20"/>
+        </w:rPr>
+        <w:t>john.smith@email.com | +1 (555) 123-4567 | linkedin.com/in/johnsmith | New York, NY</w:t>
+      </w:r>
+    </w:p>
+    <w:p>
+      <w:pPr>
+        <w:pBdr>
+          <w:bottom w:val="single" w:sz="4" w:space="1" w:color="0a2a4a"/>
+        </w:pBdr>
+        <w:spacing w:before="40" w:after="80"/>
+      </w:pPr>
+    </w:p>
+    <w:p>
+      <w:pPr>
+        <w:spacing w:before="280" w:after="40"/>
+        <w:pBdr>
+          <w:bottom w:val="single" w:sz="4" w:space="1" w:color="0a2a4a"/>
+        </w:pBdr>
+      </w:pPr>
+      <w:r>
+        <w:rPr>
+          <w:rFonts w:ascii="Times New Roman" w:hAnsi="Times New Roman"/>
+          <w:b/>
+          <w:color w:val="0A2A4A"/>
+          <w:sz w:val="24"/>
+        </w:rPr>
+        <w:t>SUMMARY</w:t>
+      </w:r>
+    </w:p>
+    <w:p>
+      <w:pPr>
+        <w:spacing w:before="20" w:after="20" w:line="300" w:lineRule="exact"/>
+        <w:ind w:left="432"/>
+      </w:pPr>
+      <w:r>
+        <w:rPr>
+          <w:rFonts w:ascii="Times New Roman" w:hAnsi="Times New Roman"/>
+          <w:color w:val="1A1A1A"/>
+          <w:sz w:val="22"/>
+        </w:rPr>
+        <w:t>Results-driven software engineer with 5+ years of experience in full-stack development.</w:t>
+      </w:r>
+    </w:p>
+    <w:p>
+      <w:pPr>
+        <w:spacing w:before="20" w:after="20" w:line="300" w:lineRule="exact"/>
+        <w:ind w:left="432"/>
+      </w:pPr>
+      <w:r>
+        <w:rPr>
+          <w:rFonts w:ascii="Times New Roman" w:hAnsi="Times New Roman"/>
+          <w:color w:val="1A1A1A"/>
+          <w:sz w:val="22"/>
+        </w:rPr>
+        <w:t>Passionate about building scalable applications and mentoring junior developers.</w:t>
+      </w:r>
+    </w:p>
+    <w:p>
+      <w:pPr>
+        <w:spacing w:before="280" w:after="40"/>
+        <w:pBdr>
+          <w:bottom w:val="single" w:sz="4" w:space="1" w:color="0a2a4a"/>
+        </w:pBdr>
+      </w:pPr>
+      <w:r>
+        <w:rPr>
+          <w:rFonts w:ascii="Times New Roman" w:hAnsi="Times New Roman"/>
+          <w:b/>
+          <w:color w:val="0A2A4A"/>
+          <w:sz w:val="24"/>
+        </w:rPr>
+        <w:t>EXPERIENCE</w:t>
+      </w:r>
+    </w:p>
+    <w:p>
+      <w:pPr>
+        <w:spacing w:before="20" w:after="20" w:line="300" w:lineRule="exact"/>
+        <w:ind w:left="432"/>
+      </w:pPr>
+      <w:r>
+        <w:rPr>
+          <w:rFonts w:ascii="Times New Roman" w:hAnsi="Times New Roman"/>
+          <w:b/>
+          <w:color w:val="1A1A1A"/>
+          <w:sz w:val="22"/>
+        </w:rPr>
+        <w:t>Senior Software Engineer — TechCorp Inc. (2021 – Present)</w:t>
+      </w:r>
+    </w:p>
+    <w:p>
+      <w:pPr>
+        <w:spacing w:before="20" w:after="20" w:line="300" w:lineRule="exact"/>
+        <w:ind w:left="720" w:hanging="288"/>
+      </w:pPr>
+      <w:r>
+        <w:rPr>
+          <w:rFonts w:ascii="Times New Roman" w:hAnsi="Times New Roman"/>
+          <w:color w:val="1A1A1A"/>
+          <w:sz w:val="22"/>
+        </w:rPr>
+        <w:t>- Led a team of 6 engineers to deliver a microservices platform serving 2M+ users</w:t>
+      </w:r>
+    </w:p>
+    <w:p>
+      <w:pPr>
+        <w:spacing w:before="20" w:after="20" w:line="300" w:lineRule="exact"/>
+        <w:ind w:left="720" w:hanging="288"/>
+      </w:pPr>
+      <w:r>
+        <w:rPr>
+          <w:rFonts w:ascii="Times New Roman" w:hAnsi="Times New Roman"/>
+          <w:color w:val="1A1A1A"/>
+          <w:sz w:val="22"/>
+        </w:rPr>
+        <w:t>- Redesigned the authentication system, reducing login failures by 40%</w:t>
+      </w:r>
+    </w:p>
+    <w:p>
+      <w:pPr>
+        <w:spacing w:before="20" w:after="20" w:line="300" w:lineRule="exact"/>
+        <w:ind w:left="720" w:hanging="288"/>
+      </w:pPr>
+      <w:r>
+        <w:rPr>
+          <w:rFonts w:ascii="Times New Roman" w:hAnsi="Times New Roman"/>
+          <w:color w:val="1A1A1A"/>
+          <w:sz w:val="22"/>
+        </w:rPr>
+        <w:t>- Implemented CI/CD pipelines that cut deployment time from 2 hours to 15 minutes</w:t>
+      </w:r>
+    </w:p>
+    <w:p>
+      <w:pPr>
+        <w:spacing w:before="0" w:after="60"/>
+      </w:pPr>
+    </w:p>
+    <w:p>
+      <w:pPr>
+        <w:spacing w:before="20" w:after="20" w:line="300" w:lineRule="exact"/>
+        <w:ind w:left="432"/>
+      </w:pPr>
+      <w:r>
+        <w:rPr>
+          <w:rFonts w:ascii="Times New Roman" w:hAnsi="Times New Roman"/>
+          <w:b/>
+          <w:color w:val="1A1A1A"/>
+          <w:sz w:val="22"/>
+        </w:rPr>
+        <w:t>Software Engineer — StartupXYZ (2019 – 2021)</w:t>
+      </w:r>
+    </w:p>
+    <w:p>
+      <w:pPr>
+        <w:spacing w:before="20" w:after="20" w:line="300" w:lineRule="exact"/>
+        <w:ind w:left="720" w:hanging="288"/>
+      </w:pPr>
+      <w:r>
+        <w:rPr>
+          <w:rFonts w:ascii="Times New Roman" w:hAnsi="Times New Roman"/>
+          <w:color w:val="1A1A1A"/>
+          <w:sz w:val="22"/>
+        </w:rPr>
+        <w:t>- Built RESTful APIs using Python/FastAPI handling 10K+ requests per second</w:t>
+      </w:r>
+    </w:p>
+    <w:p>
+      <w:pPr>
+        <w:spacing w:before="20" w:after="20" w:line="300" w:lineRule="exact"/>
+        <w:ind w:left="720" w:hanging="288"/>
+      </w:pPr>
+      <w:r>
+        <w:rPr>
+          <w:rFonts w:ascii="Times New Roman" w:hAnsi="Times New Roman"/>
+          <w:color w:val="1A1A1A"/>
+          <w:sz w:val="22"/>
+        </w:rPr>
+        <w:t>- Developed React-based dashboard used by 500+ enterprise clients</w:t>
+      </w:r>
+    </w:p>
+    <w:p>
+      <w:pPr>
+        <w:spacing w:before="20" w:after="20" w:line="300" w:lineRule="exact"/>
+        <w:ind w:left="720" w:hanging="288"/>
+      </w:pPr>
+      <w:r>
+        <w:rPr>
+          <w:rFonts w:ascii="Times New Roman" w:hAnsi="Times New Roman"/>
+          <w:color w:val="1A1A1A"/>
+          <w:sz w:val="22"/>
+        </w:rPr>
+        <w:t>- Reduced database query times by 60% through query optimization and indexing</w:t>
+      </w:r>
+    </w:p>
+    <w:p>
+      <w:pPr>
+        <w:spacing w:before="280" w:after="40"/>
+        <w:pBdr>
+          <w:bottom w:val="single" w:sz="4" w:space="1" w:color="0a2a4a"/>
+        </w:pBdr>
+      </w:pPr>
+      <w:r>
+        <w:rPr>
+          <w:rFonts w:ascii="Times New Roman" w:hAnsi="Times New Roman"/>
+          <w:b/>
+          <w:color w:val="0A2A4A"/>
+          <w:sz w:val="24"/>
+        </w:rPr>
+        <w:t>EDUCATION</w:t>
+      </w:r>
+    </w:p>
+    <w:p>
+      <w:pPr>
+        <w:spacing w:before="20" w:after="20" w:line="300" w:lineRule="exact"/>
+        <w:ind w:left="432"/>
+      </w:pPr>
+      <w:r>
+        <w:rPr>
+          <w:rFonts w:ascii="Times New Roman" w:hAnsi="Times New Roman"/>
+          <w:b/>
+          <w:color w:val="1A1A1A"/>
+          <w:sz w:val="22"/>
+        </w:rPr>
+        <w:t>Master of Science in Computer Science — Stanford University (2019)</w:t>
+      </w:r>
+    </w:p>
+    <w:p>
+      <w:pPr>
+        <w:spacing w:before="20" w:after="20" w:line="300" w:lineRule="exact"/>
+        <w:ind w:left="432"/>
+      </w:pPr>
+      <w:r>
+        <w:rPr>
+          <w:rFonts w:ascii="Times New Roman" w:hAnsi="Times New Roman"/>
+          <w:b/>
+          <w:color w:val="1A1A1A"/>
+          <w:sz w:val="22"/>
+        </w:rPr>
+        <w:t>Bachelor of Science in Computer Science — UC Berkeley (2017)</w:t>
+      </w:r>
+    </w:p>
+    <w:p>
+      <w:pPr>
+        <w:spacing w:before="280" w:after="40"/>
+        <w:pBdr>
+          <w:bottom w:val="single" w:sz="4" w:space="1" w:color="0a2a4a"/>
+        </w:pBdr>
+      </w:pPr>
+      <w:r>
+        <w:rPr>
+          <w:rFonts w:ascii="Times New Roman" w:hAnsi="Times New Roman"/>
+          <w:b/>
+          <w:color w:val="0A2A4A"/>
+          <w:sz w:val="24"/>
+        </w:rPr>
+        <w:t>SKILLS</w:t>
+      </w:r>
+    </w:p>
+    <w:p>
+      <w:pPr>
+        <w:spacing w:before="20" w:after="20" w:line="300" w:lineRule="exact"/>
+        <w:ind w:left="720" w:hanging="288"/>
+      </w:pPr>
+      <w:r>
+        <w:rPr>
+          <w:rFonts w:ascii="Times New Roman" w:hAnsi="Times New Roman"/>
+          <w:color w:val="1A1A1A"/>
+          <w:sz w:val="22"/>
+        </w:rPr>
+        <w:t>- Python, JavaScript, TypeScript, Go</w:t>
+      </w:r>
+    </w:p>
+    <w:p>
+      <w:pPr>
+        <w:spacing w:before="20" w:after="20" w:line="300" w:lineRule="exact"/>
+        <w:ind w:left="720" w:hanging="288"/>
+      </w:pPr>
+      <w:r>
+        <w:rPr>
+          <w:rFonts w:ascii="Times New Roman" w:hAnsi="Times New Roman"/>
+          <w:color w:val="1A1A1A"/>
+          <w:sz w:val="22"/>
+        </w:rPr>
+        <w:t>- React, Next.js, FastAPI, Django</w:t>
+      </w:r>
+    </w:p>
+    <w:p>
+      <w:pPr>
+        <w:spacing w:before="20" w:after="20" w:line="300" w:lineRule="exact"/>
+        <w:ind w:left="720" w:hanging="288"/>
+      </w:pPr>
+      <w:r>
+        <w:rPr>
+          <w:rFonts w:ascii="Times New Roman" w:hAnsi="Times New Roman"/>
+          <w:color w:val="1A1A1A"/>
+          <w:sz w:val="22"/>
+        </w:rPr>
+        <w:t>- PostgreSQL, Redis, MongoDB</w:t>
+      </w:r>
+    </w:p>
+    <w:p>
+      <w:pPr>
+        <w:spacing w:before="20" w:after="20" w:line="300" w:lineRule="exact"/>
+        <w:ind w:left="720" w:hanging="288"/>
+      </w:pPr>
+      <w:r>
+        <w:rPr>
+          <w:rFonts w:ascii="Times New Roman" w:hAnsi="Times New Roman"/>
+          <w:color w:val="1A1A1A"/>
+          <w:sz w:val="22"/>
+        </w:rPr>
+        <w:t>- AWS, Docker, Kubernetes, CI/CD</w:t>
+      </w:r>
+    </w:p>
+    <w:p>
+      <w:pPr>
+        <w:spacing w:before="20" w:after="20" w:line="300" w:lineRule="exact"/>
+        <w:ind w:left="720" w:hanging="288"/>
+      </w:pPr>
+      <w:r>
+        <w:rPr>
+          <w:rFonts w:ascii="Times New Roman" w:hAnsi="Times New Roman"/>
+          <w:color w:val="1A1A1A"/>
+          <w:sz w:val="22"/>
+        </w:rPr>
+        <w:t>- System Design, Agile/Scrum</w:t>
+      </w:r>
+    </w:p>
+    <w:p>
+      <w:pPr>
+        <w:spacing w:before="280" w:after="40"/>
+        <w:pBdr>
+          <w:bottom w:val="single" w:sz="4" w:space="1" w:color="0a2a4a"/>
+        </w:pBdr>
+      </w:pPr>
+      <w:r>
+        <w:rPr>
+          <w:rFonts w:ascii="Times New Roman" w:hAnsi="Times New Roman"/>
+          <w:b/>
+          <w:color w:val="0A2A4A"/>
+          <w:sz w:val="24"/>
+        </w:rPr>
+        <w:t>CERTIFICATIONS</w:t>
+      </w:r>
+    </w:p>
+    <w:p>
+      <w:pPr>
+        <w:spacing w:before="20" w:after="20" w:line="300" w:lineRule="exact"/>
+        <w:ind w:left="720" w:hanging="288"/>
+      </w:pPr>
+      <w:r>
+        <w:rPr>
+          <w:rFonts w:ascii="Times New Roman" w:hAnsi="Times New Roman"/>
+          <w:color w:val="1A1A1A"/>
+          <w:sz w:val="22"/>
+        </w:rPr>
+        <w:t>- AWS Solutions Architect – Professional</w:t>
+      </w:r>
+    </w:p>
+    <w:p>
+      <w:pPr>
+        <w:spacing w:before="20" w:after="20" w:line="300" w:lineRule="exact"/>
+        <w:ind w:left="720" w:hanging="288"/>
+      </w:pPr>
+      <w:r>
+        <w:rPr>
+          <w:rFonts w:ascii="Times New Roman" w:hAnsi="Times New Roman"/>
+          <w:color w:val="1A1A1A"/>
+          <w:sz w:val="22"/>
+        </w:rPr>
+        <w:t>- Google Cloud Professional Data Engineer</w:t>
+      </w:r>
+    </w:p>
+    <w:p>
+      <w:pPr>
+        <w:spacing w:before="280" w:after="40"/>
+        <w:pBdr>
+          <w:bottom w:val="single" w:sz="4" w:space="1" w:color="0a2a4a"/>
+        </w:pBdr>
+      </w:pPr>
+      <w:r>
+        <w:rPr>
+          <w:rFonts w:ascii="Times New Roman" w:hAnsi="Times New Roman"/>
+          <w:b/>
+          <w:color w:val="0A2A4A"/>
+          <w:sz w:val="24"/>
+        </w:rPr>
+        <w:t>PROJECTS</w:t>
+      </w:r>
+    </w:p>
+    <w:p>
+      <w:pPr>
+        <w:spacing w:before="20" w:after="20" w:line="300" w:lineRule="exact"/>
+        <w:ind w:left="432"/>
+      </w:pPr>
+      <w:r>
+        <w:rPr>
+          <w:rFonts w:ascii="Times New Roman" w:hAnsi="Times New Roman"/>
+          <w:b/>
+          <w:color w:val="1A1A1A"/>
+          <w:sz w:val="22"/>
+        </w:rPr>
+        <w:t>Open-Source Resume Builder (2022)</w:t>
+      </w:r>
+    </w:p>
+    <w:p>
+      <w:pPr>
+        <w:spacing w:before="20" w:after="20" w:line="300" w:lineRule="exact"/>
+        <w:ind w:left="720" w:hanging="288"/>
+      </w:pPr>
+      <w:r>
+        <w:rPr>
+          <w:rFonts w:ascii="Times New Roman" w:hAnsi="Times New Roman"/>
+          <w:color w:val="1A1A1A"/>
+          <w:sz w:val="22"/>
+        </w:rPr>
+        <w:t>- Built a tool that generates ATS-friendly resumes from YAML input</w:t>
+      </w:r>
+    </w:p>
+    <w:p>
+      <w:pPr>
+        <w:spacing w:before="20" w:after="20" w:line="300" w:lineRule="exact"/>
+        <w:ind w:left="720" w:hanging="288"/>
+      </w:pPr>
+      <w:r>
+        <w:rPr>
+          <w:rFonts w:ascii="Times New Roman" w:hAnsi="Times New Roman"/>
+          <w:color w:val="1A1A1A"/>
+          <w:sz w:val="22"/>
+        </w:rPr>
+        <w:t>- 500+ GitHub stars, 50+ contributors</w:t>
+      </w:r>
+    </w:p>
+    <w:p>
+      <w:pPr>
+        <w:spacing w:before="280" w:after="40"/>
+        <w:pBdr>
+          <w:bottom w:val="single" w:sz="4" w:space="1" w:color="0a2a4a"/>
+        </w:pBdr>
+      </w:pPr>
+      <w:r>
+        <w:rPr>
+          <w:rFonts w:ascii="Times New Roman" w:hAnsi="Times New Roman"/>
+          <w:b/>
+          <w:color w:val="0A2A4A"/>
+          <w:sz w:val="24"/>
+        </w:rPr>
+        <w:t>LANGUAGES</w:t>
+      </w:r>
+    </w:p>
+    <w:p>
+      <w:pPr>
+        <w:spacing w:before="20" w:after="20" w:line="300" w:lineRule="exact"/>
+        <w:ind w:left="720" w:hanging="288"/>
+      </w:pPr>
+      <w:r>
+        <w:rPr>
+          <w:rFonts w:ascii="Times New Roman" w:hAnsi="Times New Roman"/>
+          <w:color w:val="1A1A1A"/>
+          <w:sz w:val="22"/>
+        </w:rPr>
+        <w:t>- English (Native)</w:t>
+      </w:r>
+    </w:p>
+    <w:p>
+      <w:pPr>
+        <w:spacing w:before="20" w:after="20" w:line="300" w:lineRule="exact"/>
+        <w:ind w:left="720" w:hanging="288"/>
+      </w:pPr>
+      <w:r>
+        <w:rPr>
+          <w:rFonts w:ascii="Times New Roman" w:hAnsi="Times New Roman"/>
+          <w:color w:val="1A1A1A"/>
+          <w:sz w:val="22"/>
+        </w:rPr>
+        <w:t>- Mandarin Chinese (Fluent)</w:t>
       </w:r>
     </w:p>
     <w:sectPr>
@@ -407,10 +900,13 @@
     <w:name w:val="Normal"/>
     <w:qFormat/>
     <w:rsid w:val="00FC693F"/>
+    <w:pPr>
+      <w:spacing w:after="40"/>
+    </w:pPr>
     <w:rPr>
       <w:rFonts w:ascii="Times New Roman" w:hAnsi="Times New Roman"/>
       <w:color w:val="1A1A1A"/>
-      <w:sz w:val="24"/>
+      <w:sz w:val="22"/>
     </w:rPr>
   </w:style>
   <w:style w:type="paragraph" w:styleId="Header">

</xml_diff>